<commit_message>
Add remaining haiku documents, images, and skill files
Co-Authored-By: Claude Sonnet 5 <noreply@anthropic.com>
</commit_message>
<xml_diff>
--- a/Tokuo dog.docx
+++ b/Tokuo dog.docx
@@ -11,7 +11,6 @@
           <w:highlight w:val="none"/>
         </w:rPr>
       </w:pPr>
-      <w:r/>
       <w:r>
         <mc:AlternateContent>
           <mc:Choice Requires="wpg">
@@ -54,13 +53,7 @@
                               <w:pBdr/>
                               <w:spacing/>
                               <w:ind/>
-                              <w:rPr>
-                                <w:rFonts w:ascii="Open Sans" w:hAnsi="Open Sans" w:cs="Open Sans"/>
-                                <w:b w:val="0"/>
-                                <w:bCs w:val="0"/>
-                                <w:sz w:val="18"/>
-                                <w:szCs w:val="18"/>
-                              </w:rPr>
+                              <w:rPr/>
                             </w:pPr>
                             <w:r>
                               <w:rPr>
@@ -70,8 +63,17 @@
                                 <w:sz w:val="18"/>
                                 <w:szCs w:val="18"/>
                               </w:rPr>
-                              <w:t xml:space="preserve">Brown little dog—</w:t>
+                              <w:t xml:space="preserve">Valley, rest a while—</w:t>
                             </w:r>
+                            <w:r/>
+                          </w:p>
+                          <w:p>
+                            <w:pPr>
+                              <w:pBdr/>
+                              <w:spacing/>
+                              <w:ind/>
+                              <w:rPr/>
+                            </w:pPr>
                             <w:r>
                               <w:rPr>
                                 <w:rFonts w:ascii="Open Sans" w:hAnsi="Open Sans" w:eastAsia="Open Sans" w:cs="Open Sans"/>
@@ -80,7 +82,28 @@
                                 <w:sz w:val="18"/>
                                 <w:szCs w:val="18"/>
                               </w:rPr>
+                              <w:t xml:space="preserve">the old dike remembers;</w:t>
                             </w:r>
+                            <w:r/>
+                          </w:p>
+                          <w:p>
+                            <w:pPr>
+                              <w:pBdr/>
+                              <w:spacing/>
+                              <w:ind/>
+                              <w:rPr/>
+                            </w:pPr>
+                            <w:r>
+                              <w:rPr>
+                                <w:rFonts w:ascii="Open Sans" w:hAnsi="Open Sans" w:eastAsia="Open Sans" w:cs="Open Sans"/>
+                                <w:b w:val="0"/>
+                                <w:bCs w:val="0"/>
+                                <w:sz w:val="18"/>
+                                <w:szCs w:val="18"/>
+                              </w:rPr>
+                              <w:t xml:space="preserve">love rises into the mountains,</w:t>
+                            </w:r>
+                            <w:r/>
                           </w:p>
                           <w:p>
                             <w:pPr>
@@ -103,41 +126,9 @@
                                 <w:sz w:val="18"/>
                                 <w:szCs w:val="18"/>
                               </w:rPr>
-                              <w:t xml:space="preserve">bringing me its favorite toy,</w:t>
+                              <w:t xml:space="preserve">and light falls upon the cane.</w:t>
                             </w:r>
-                            <w:r>
-                              <w:rPr>
-                                <w:rFonts w:ascii="Open Sans" w:hAnsi="Open Sans" w:eastAsia="Open Sans" w:cs="Open Sans"/>
-                                <w:b w:val="0"/>
-                                <w:bCs w:val="0"/>
-                                <w:sz w:val="18"/>
-                                <w:szCs w:val="18"/>
-                              </w:rPr>
-                            </w:r>
-                          </w:p>
-                          <w:p>
-                            <w:pPr>
-                              <w:pBdr/>
-                              <w:spacing/>
-                              <w:ind/>
-                              <w:rPr>
-                                <w:rFonts w:ascii="Open Sans" w:hAnsi="Open Sans" w:cs="Open Sans"/>
-                                <w:b w:val="0"/>
-                                <w:bCs w:val="0"/>
-                                <w:sz w:val="18"/>
-                                <w:szCs w:val="18"/>
-                              </w:rPr>
-                            </w:pPr>
-                            <w:r>
-                              <w:rPr>
-                                <w:rFonts w:ascii="Open Sans" w:hAnsi="Open Sans" w:eastAsia="Open Sans" w:cs="Open Sans"/>
-                                <w:b w:val="0"/>
-                                <w:bCs w:val="0"/>
-                                <w:sz w:val="18"/>
-                                <w:szCs w:val="18"/>
-                              </w:rPr>
-                              <w:t xml:space="preserve">dreaming of a stick.</w:t>
-                            </w:r>
+                            <w:r/>
                             <w:r>
                               <w:rPr>
                                 <w:rFonts w:ascii="Open Sans" w:hAnsi="Open Sans" w:eastAsia="Open Sans" w:cs="Open Sans"/>
@@ -149,7 +140,7 @@
                             </w:r>
                             <w:r>
                               <w:rPr>
-                                <w:rFonts w:ascii="Open Sans" w:hAnsi="Open Sans" w:eastAsia="Open Sans" w:cs="Open Sans"/>
+                                <w:rFonts w:ascii="Open Sans" w:hAnsi="Open Sans" w:cs="Open Sans"/>
                                 <w:b w:val="0"/>
                                 <w:bCs w:val="0"/>
                                 <w:sz w:val="18"/>
@@ -176,13 +167,7 @@
                         <w:pBdr/>
                         <w:spacing/>
                         <w:ind/>
-                        <w:rPr>
-                          <w:rFonts w:ascii="Open Sans" w:hAnsi="Open Sans" w:cs="Open Sans"/>
-                          <w:b w:val="0"/>
-                          <w:bCs w:val="0"/>
-                          <w:sz w:val="18"/>
-                          <w:szCs w:val="18"/>
-                        </w:rPr>
+                        <w:rPr/>
                       </w:pPr>
                       <w:r>
                         <w:rPr>
@@ -192,8 +177,17 @@
                           <w:sz w:val="18"/>
                           <w:szCs w:val="18"/>
                         </w:rPr>
-                        <w:t xml:space="preserve">Brown little dog—</w:t>
+                        <w:t xml:space="preserve">Valley, rest a while—</w:t>
                       </w:r>
+                      <w:r/>
+                    </w:p>
+                    <w:p>
+                      <w:pPr>
+                        <w:pBdr/>
+                        <w:spacing/>
+                        <w:ind/>
+                        <w:rPr/>
+                      </w:pPr>
                       <w:r>
                         <w:rPr>
                           <w:rFonts w:ascii="Open Sans" w:hAnsi="Open Sans" w:eastAsia="Open Sans" w:cs="Open Sans"/>
@@ -202,7 +196,28 @@
                           <w:sz w:val="18"/>
                           <w:szCs w:val="18"/>
                         </w:rPr>
+                        <w:t xml:space="preserve">the old dike remembers;</w:t>
                       </w:r>
+                      <w:r/>
+                    </w:p>
+                    <w:p>
+                      <w:pPr>
+                        <w:pBdr/>
+                        <w:spacing/>
+                        <w:ind/>
+                        <w:rPr/>
+                      </w:pPr>
+                      <w:r>
+                        <w:rPr>
+                          <w:rFonts w:ascii="Open Sans" w:hAnsi="Open Sans" w:eastAsia="Open Sans" w:cs="Open Sans"/>
+                          <w:b w:val="0"/>
+                          <w:bCs w:val="0"/>
+                          <w:sz w:val="18"/>
+                          <w:szCs w:val="18"/>
+                        </w:rPr>
+                        <w:t xml:space="preserve">love rises into the mountains,</w:t>
+                      </w:r>
+                      <w:r/>
                     </w:p>
                     <w:p>
                       <w:pPr>
@@ -225,41 +240,9 @@
                           <w:sz w:val="18"/>
                           <w:szCs w:val="18"/>
                         </w:rPr>
-                        <w:t xml:space="preserve">bringing me its favorite toy,</w:t>
+                        <w:t xml:space="preserve">and light falls upon the cane.</w:t>
                       </w:r>
-                      <w:r>
-                        <w:rPr>
-                          <w:rFonts w:ascii="Open Sans" w:hAnsi="Open Sans" w:eastAsia="Open Sans" w:cs="Open Sans"/>
-                          <w:b w:val="0"/>
-                          <w:bCs w:val="0"/>
-                          <w:sz w:val="18"/>
-                          <w:szCs w:val="18"/>
-                        </w:rPr>
-                      </w:r>
-                    </w:p>
-                    <w:p>
-                      <w:pPr>
-                        <w:pBdr/>
-                        <w:spacing/>
-                        <w:ind/>
-                        <w:rPr>
-                          <w:rFonts w:ascii="Open Sans" w:hAnsi="Open Sans" w:cs="Open Sans"/>
-                          <w:b w:val="0"/>
-                          <w:bCs w:val="0"/>
-                          <w:sz w:val="18"/>
-                          <w:szCs w:val="18"/>
-                        </w:rPr>
-                      </w:pPr>
-                      <w:r>
-                        <w:rPr>
-                          <w:rFonts w:ascii="Open Sans" w:hAnsi="Open Sans" w:eastAsia="Open Sans" w:cs="Open Sans"/>
-                          <w:b w:val="0"/>
-                          <w:bCs w:val="0"/>
-                          <w:sz w:val="18"/>
-                          <w:szCs w:val="18"/>
-                        </w:rPr>
-                        <w:t xml:space="preserve">dreaming of a stick.</w:t>
-                      </w:r>
+                      <w:r/>
                       <w:r>
                         <w:rPr>
                           <w:rFonts w:ascii="Open Sans" w:hAnsi="Open Sans" w:eastAsia="Open Sans" w:cs="Open Sans"/>
@@ -271,7 +254,7 @@
                       </w:r>
                       <w:r>
                         <w:rPr>
-                          <w:rFonts w:ascii="Open Sans" w:hAnsi="Open Sans" w:eastAsia="Open Sans" w:cs="Open Sans"/>
+                          <w:rFonts w:ascii="Open Sans" w:hAnsi="Open Sans" w:cs="Open Sans"/>
                           <w:b w:val="0"/>
                           <w:bCs w:val="0"/>
                           <w:sz w:val="18"/>
@@ -290,15 +273,15 @@
         <mc:AlternateContent>
           <mc:Choice Requires="wpg">
             <w:drawing>
-              <wp:anchor xmlns:wp="http://schemas.openxmlformats.org/drawingml/2006/wordprocessingDrawing" xmlns:wp14="http://schemas.microsoft.com/office/word/2010/wordprocessingDrawing" distT="0" distB="0" distL="115200" distR="115200" simplePos="0" relativeHeight="5631" behindDoc="1" locked="0" layoutInCell="1" allowOverlap="1">
+              <wp:anchor xmlns:wp="http://schemas.openxmlformats.org/drawingml/2006/wordprocessingDrawing" xmlns:wp14="http://schemas.microsoft.com/office/word/2010/wordprocessingDrawing" distT="0" distB="0" distL="115200" distR="115200" simplePos="0" relativeHeight="27648" behindDoc="1" locked="0" layoutInCell="1" allowOverlap="1">
                 <wp:simplePos x="0" y="0"/>
                 <wp:positionH relativeFrom="column">
-                  <wp:posOffset>277812</wp:posOffset>
+                  <wp:posOffset>0</wp:posOffset>
                 </wp:positionH>
                 <wp:positionV relativeFrom="paragraph">
-                  <wp:posOffset>0</wp:posOffset>
+                  <wp:posOffset>113626</wp:posOffset>
                 </wp:positionV>
-                <wp:extent cx="2016125" cy="2305638"/>
+                <wp:extent cx="2016125" cy="1686281"/>
                 <wp:effectExtent l="0" t="0" r="0" b="0"/>
                 <wp:wrapNone/>
                 <wp:docPr id="2" name=""/>
@@ -309,7 +292,7 @@
                   <a:graphicData uri="http://schemas.openxmlformats.org/drawingml/2006/picture">
                     <pic:pic xmlns:pic="http://schemas.openxmlformats.org/drawingml/2006/picture">
                       <pic:nvPicPr>
-                        <pic:cNvPr id="975786042" name=""/>
+                        <pic:cNvPr id="2036446930" name=""/>
                         <pic:cNvPicPr>
                           <a:picLocks noChangeAspect="1"/>
                         </pic:cNvPicPr>
@@ -322,7 +305,7 @@
                       <pic:spPr bwMode="auto">
                         <a:xfrm>
                           <a:off x="0" y="0"/>
-                          <a:ext cx="2016124" cy="2305637"/>
+                          <a:ext cx="2016124" cy="1686280"/>
                         </a:xfrm>
                         <a:prstGeom prst="rect">
                           <a:avLst/>
@@ -355,7 +338,7 @@
                 <v:path o:extrusionok="f" gradientshapeok="t" o:connecttype="rect"/>
                 <o:lock v:ext="edit" aspectratio="t"/>
               </v:shapetype>
-              <v:shape id="_x0000_i1" o:spid="_x0000_s1" type="#_x0000_t75" style="position:absolute;z-index:-5631;o:allowoverlap:true;o:allowincell:true;mso-position-horizontal-relative:text;margin-left:21.87pt;mso-position-horizontal:absolute;mso-position-vertical-relative:text;margin-top:0.00pt;mso-position-vertical:absolute;width:158.75pt;height:181.55pt;mso-wrap-distance-left:9.07pt;mso-wrap-distance-top:0.00pt;mso-wrap-distance-right:9.07pt;mso-wrap-distance-bottom:0.00pt;z-index:1;" stroked="false">
+              <v:shape id="_x0000_i1" o:spid="_x0000_s1" type="#_x0000_t75" style="position:absolute;z-index:-27648;o:allowoverlap:true;o:allowincell:true;mso-position-horizontal-relative:text;margin-left:0.00pt;mso-position-horizontal:absolute;mso-position-vertical-relative:text;margin-top:8.95pt;mso-position-vertical:absolute;width:158.75pt;height:132.78pt;mso-wrap-distance-left:9.07pt;mso-wrap-distance-top:0.00pt;mso-wrap-distance-right:9.07pt;mso-wrap-distance-bottom:0.00pt;z-index:1;" stroked="false">
                 <v:imagedata r:id="rId8" o:title=""/>
                 <o:lock v:ext="edit" rotation="t"/>
               </v:shape>
@@ -363,6 +346,7 @@
           </mc:Fallback>
         </mc:AlternateContent>
       </w:r>
+      <w:r/>
       <w:r/>
       <w:r>
         <mc:AlternateContent>
@@ -442,94 +426,6 @@
         </mc:AlternateContent>
       </w:r>
       <w:r/>
-      <w:r/>
-      <w:r/>
-      <w:r/>
-      <w:r/>
-      <w:r>
-        <w:rPr>
-          <w:highlight w:val="none"/>
-        </w:rPr>
-      </w:r>
-      <w:r>
-        <mc:AlternateContent>
-          <mc:Choice Requires="wpg">
-            <w:drawing>
-              <wp:anchor xmlns:wp="http://schemas.openxmlformats.org/drawingml/2006/wordprocessingDrawing" xmlns:wp14="http://schemas.microsoft.com/office/word/2010/wordprocessingDrawing" distT="0" distB="0" distL="115200" distR="115200" simplePos="0" relativeHeight="26624" behindDoc="1" locked="0" layoutInCell="1" allowOverlap="1">
-                <wp:simplePos x="0" y="0"/>
-                <wp:positionH relativeFrom="column">
-                  <wp:posOffset>-69161</wp:posOffset>
-                </wp:positionH>
-                <wp:positionV relativeFrom="paragraph">
-                  <wp:posOffset>0</wp:posOffset>
-                </wp:positionV>
-                <wp:extent cx="1934961" cy="2197479"/>
-                <wp:effectExtent l="0" t="0" r="0" b="0"/>
-                <wp:wrapNone/>
-                <wp:docPr id="4" name=""/>
-                <wp:cNvGraphicFramePr>
-                  <a:graphicFrameLocks xmlns:a="http://schemas.openxmlformats.org/drawingml/2006/main" noChangeAspect="1"/>
-                </wp:cNvGraphicFramePr>
-                <a:graphic xmlns:a="http://schemas.openxmlformats.org/drawingml/2006/main">
-                  <a:graphicData uri="http://schemas.openxmlformats.org/drawingml/2006/picture">
-                    <pic:pic xmlns:pic="http://schemas.openxmlformats.org/drawingml/2006/picture">
-                      <pic:nvPicPr>
-                        <pic:cNvPr id="415816913" name=""/>
-                        <pic:cNvPicPr>
-                          <a:picLocks noChangeAspect="1"/>
-                        </pic:cNvPicPr>
-                        <pic:nvPr/>
-                      </pic:nvPicPr>
-                      <pic:blipFill rotWithShape="1">
-                        <a:blip r:embed="rId10">
-                          <a:alphaModFix amt="7999"/>
-                        </a:blip>
-                        <a:stretch/>
-                      </pic:blipFill>
-                      <pic:spPr bwMode="auto">
-                        <a:xfrm flipH="0" flipV="0">
-                          <a:off x="0" y="0"/>
-                          <a:ext cx="1934961" cy="2197478"/>
-                        </a:xfrm>
-                        <a:prstGeom prst="rect">
-                          <a:avLst/>
-                        </a:prstGeom>
-                      </pic:spPr>
-                    </pic:pic>
-                  </a:graphicData>
-                </a:graphic>
-              </wp:anchor>
-            </w:drawing>
-          </mc:Choice>
-          <mc:Fallback>
-            <w:pict>
-              <v:shapetype id="_x0000_t75" coordsize="21600,21600" o:spt="75" o:preferrelative="t" path="m@4@5l@4@11@9@11@9@5xe" filled="f" stroked="f">
-                <v:stroke joinstyle="miter"/>
-                <v:formulas>
-                  <v:f eqn="if lineDrawn pixelLineWidth 0"/>
-                  <v:f eqn="sum @0 1 0"/>
-                  <v:f eqn="sum 0 0 @1"/>
-                  <v:f eqn="prod @2 1 2"/>
-                  <v:f eqn="prod @3 21600 pixelWidth"/>
-                  <v:f eqn="prod @3 21600 pixelHeight"/>
-                  <v:f eqn="sum @0 0 1"/>
-                  <v:f eqn="prod @6 1 2"/>
-                  <v:f eqn="prod @7 21600 pixelWidth"/>
-                  <v:f eqn="sum @8 21600 0"/>
-                  <v:f eqn="prod @7 21600 pixelHeight"/>
-                  <v:f eqn="sum @10 21600 0"/>
-                </v:formulas>
-                <v:path o:extrusionok="f" gradientshapeok="t" o:connecttype="rect"/>
-                <o:lock v:ext="edit" aspectratio="t"/>
-              </v:shapetype>
-              <v:shape id="_x0000_i3" o:spid="_x0000_s3" type="#_x0000_t75" style="position:absolute;z-index:-26624;o:allowoverlap:true;o:allowincell:true;mso-position-horizontal-relative:text;margin-left:-5.45pt;mso-position-horizontal:absolute;mso-position-vertical-relative:text;margin-top:0.00pt;mso-position-vertical:absolute;width:152.36pt;height:173.03pt;mso-wrap-distance-left:9.07pt;mso-wrap-distance-top:0.00pt;mso-wrap-distance-right:9.07pt;mso-wrap-distance-bottom:0.00pt;z-index:1;" stroked="false">
-                <v:imagedata r:id="rId10" o:title=""/>
-                <o:lock v:ext="edit" rotation="t"/>
-              </v:shape>
-            </w:pict>
-          </mc:Fallback>
-        </mc:AlternateContent>
-      </w:r>
       <w:r>
         <w:rPr>
           <w:highlight w:val="none"/>

</xml_diff>